<commit_message>
Resolve technical review findings: 2D dissipation map, ASME V&V 20-2009 GCI, extended Re=10k unsteady marching, and Elsevier submission package
</commit_message>
<xml_diff>
--- a/submission_package/02_Highlights.docx
+++ b/submission_package/02_Highlights.docx
@@ -12,20 +12,20 @@
     </w:p>
     <w:p>
       <w:r>
-        <w:t>Title: A High-Resolution Finite-Difference Benchmark for Steady Continuation and Hopf Bifurcation Dynamics up to Extreme Reynolds Numbers (Re = 100,000) in 2D Lid-Driven Cavity Flows</w:t>
+        <w:t>Manuscript Title: A High-Resolution Finite-Difference Benchmark for Steady Continuation and Hopf Bifurcation Dynamics up to Extreme Reynolds Numbers (Re = 100,000) in 2D Lid-Driven Cavity Flows</w:t>
       </w:r>
     </w:p>
     <w:p>
       <w:r>
-        <w:t>Author: Kartikey Singh (ORCID: 0009-0009-1973-7532)</w:t>
+        <w:t>Author: Kartikey Singh (Department of Mathematics, University of Delhi, Delhi, India)</w:t>
       </w:r>
     </w:p>
     <w:p>
       <w:r>
-        <w:t>Journal: Computers &amp; Fluids (Elsevier)</w:t>
+        <w:t>Target Journal: Computers &amp; Fluids (Elsevier)</w:t>
+        <w:br/>
       </w:r>
     </w:p>
-    <w:p/>
     <w:p>
       <w:pPr>
         <w:pStyle w:val="ListBullet"/>
@@ -39,7 +39,7 @@
         <w:pStyle w:val="ListBullet"/>
       </w:pPr>
       <w:r>
-        <w:t>Pure central differencing achieves zero artificial viscosity up to Re = 50,000.</w:t>
+        <w:t>Pure central differencing achieves zero numerical viscosity up to Re = 50,000.</w:t>
       </w:r>
     </w:p>
     <w:p>
@@ -47,7 +47,7 @@
         <w:pStyle w:val="ListBullet"/>
       </w:pPr>
       <w:r>
-        <w:t>Localized hybrid scheme regularizes corner shocks at Re = 100,000 on 1025 x 1025.</w:t>
+        <w:t>Localized hybrid scheme regularizes corner shocks at Re = 100,000 on 1025x1025.</w:t>
       </w:r>
     </w:p>
     <w:p>
@@ -55,7 +55,7 @@
         <w:pStyle w:val="ListBullet"/>
       </w:pPr>
       <w:r>
-        <w:t>Symmetric core convergence confirms Batchelor's asymptotic theorem at high Re.</w:t>
+        <w:t>Asymptotic core vorticity plateau confirms Batchelor's theorem at high Re.</w:t>
       </w:r>
     </w:p>
     <w:p>
@@ -63,7 +63,7 @@
         <w:pStyle w:val="ListBullet"/>
       </w:pPr>
       <w:r>
-        <w:t>Time-accurate 513 x 513 marching maps Hopf bifurcation cascades to Re = 100,000.</w:t>
+        <w:t>Time-accurate 513x513 marching resolves limit cycles and unsteady dynamics.</w:t>
       </w:r>
     </w:p>
     <w:sectPr>

</xml_diff>

<commit_message>
Synchronize docx files, declaration PDF, and submission metadata with finalized manuscript
</commit_message>
<xml_diff>
--- a/submission_package/02_Highlights.docx
+++ b/submission_package/02_Highlights.docx
@@ -12,18 +12,42 @@
     </w:p>
     <w:p>
       <w:r>
-        <w:t>Manuscript Title: A High-Resolution Finite-Difference Benchmark for Steady Continuation and Hopf Bifurcation Dynamics up to Extreme Reynolds Numbers (Re = 100,000) in 2D Lid-Driven Cavity Flows</w:t>
+        <w:rPr>
+          <w:b/>
+        </w:rPr>
+        <w:t xml:space="preserve">Manuscript Title: </w:t>
+      </w:r>
+      <w:r>
+        <w:t>A High-Resolution Finite-Difference Framework for Steady Continuation and Finite-Window Unsteady Dynamics up to Re = 100,000 in 2D Lid-Driven Cavity Flows</w:t>
       </w:r>
     </w:p>
     <w:p>
       <w:r>
-        <w:t>Author: Kartikey Singh (Department of Mathematics, University of Delhi, Delhi, India)</w:t>
+        <w:rPr>
+          <w:b/>
+        </w:rPr>
+        <w:t xml:space="preserve">Author: </w:t>
+      </w:r>
+      <w:r>
+        <w:t>Kartikey Singh (Department of Mathematics, University of Delhi, Delhi, 110007, India)</w:t>
+        <w:br/>
+        <w:t>ORCID: https://orcid.org/0009-0009-1973-7532</w:t>
       </w:r>
     </w:p>
     <w:p>
       <w:r>
-        <w:t>Target Journal: Computers &amp; Fluids (Elsevier)</w:t>
-        <w:br/>
+        <w:rPr>
+          <w:b/>
+        </w:rPr>
+        <w:t xml:space="preserve">Target Journal: </w:t>
+      </w:r>
+      <w:r>
+        <w:t>Computers &amp; Fluids (Elsevier)</w:t>
+      </w:r>
+    </w:p>
+    <w:p>
+      <w:r>
+        <w:t>Highlights (Each bullet strictly &lt;= 85 characters including spaces):</w:t>
       </w:r>
     </w:p>
     <w:p>
@@ -39,7 +63,7 @@
         <w:pStyle w:val="ListBullet"/>
       </w:pPr>
       <w:r>
-        <w:t>Pure central differencing achieves zero numerical viscosity up to Re = 50,000.</w:t>
+        <w:t>Pure central differencing retains zero numerical viscosity for Re &lt;= 50,000.</w:t>
       </w:r>
     </w:p>
     <w:p>
@@ -47,7 +71,7 @@
         <w:pStyle w:val="ListBullet"/>
       </w:pPr>
       <w:r>
-        <w:t>- Interior hybrid scheme regularizes corner singularity at Re = 100,000 on 1025x1025.</w:t>
+        <w:t>Interior hybrid scheme stabilizes corner singularity at Re = 100,000.</w:t>
       </w:r>
     </w:p>
     <w:p>
@@ -55,7 +79,7 @@
         <w:pStyle w:val="ListBullet"/>
       </w:pPr>
       <w:r>
-        <w:t>Asymptotic core vorticity plateau confirms Batchelor's theorem at high Re.</w:t>
+        <w:t>Core vorticity profiles show qualitative alignment with Batchelor theorem.</w:t>
       </w:r>
     </w:p>
     <w:p>
@@ -63,7 +87,7 @@
         <w:pStyle w:val="ListBullet"/>
       </w:pPr>
       <w:r>
-        <w:t>Time-accurate 513x513 marching resolves limit cycles and unsteady dynamics.</w:t>
+        <w:t>Unsteady marching on 513x513 grids resolves finite-window shedding modes.</w:t>
       </w:r>
     </w:p>
     <w:sectPr>

</xml_diff>

<commit_message>
docs(submission): update Highlights and Competing Interest docx for AMM and Kartikeya Gangwar
</commit_message>
<xml_diff>
--- a/submission_package/02_Highlights.docx
+++ b/submission_package/02_Highlights.docx
@@ -12,37 +12,22 @@
     </w:p>
     <w:p>
       <w:r>
-        <w:rPr>
-          <w:b/>
-        </w:rPr>
-        <w:t xml:space="preserve">Manuscript Title: </w:t>
-      </w:r>
-      <w:r>
-        <w:t>A High-Resolution Finite-Difference Framework for Steady Continuation and Finite-Window Unsteady Dynamics up to Re = 100,000 in 2D Lid-Driven Cavity Flows</w:t>
+        <w:t>Manuscript Title: A High-Resolution Finite-Difference Framework for Steady Continuation and Finite-Window Unsteady Dynamics up to Re = 100,000 in 2D Lid-Driven Cavity Flows</w:t>
       </w:r>
     </w:p>
     <w:p>
       <w:r>
-        <w:rPr>
-          <w:b/>
-        </w:rPr>
-        <w:t xml:space="preserve">Author: </w:t>
+        <w:t>Author: Kartikeya Gangwar (Department of Mathematics, University of Delhi, Delhi, 110007, India)</w:t>
       </w:r>
+    </w:p>
+    <w:p>
       <w:r>
-        <w:t>Kartikey Singh (Department of Mathematics, University of Delhi, Delhi, 110007, India)</w:t>
-        <w:br/>
         <w:t>ORCID: https://orcid.org/0009-0009-1973-7532</w:t>
       </w:r>
     </w:p>
     <w:p>
       <w:r>
-        <w:rPr>
-          <w:b/>
-        </w:rPr>
-        <w:t xml:space="preserve">Target Journal: </w:t>
-      </w:r>
-      <w:r>
-        <w:t>Computers &amp; Fluids (Elsevier)</w:t>
+        <w:t>Target Journal: Applied Mathematical Modelling (Elsevier)</w:t>
       </w:r>
     </w:p>
     <w:p>

</xml_diff>